<commit_message>
fix: make oriented grapgh for hw 6
</commit_message>
<xml_diff>
--- a/1-2_Discrete_math/2sem/homeworks/ДЗ 6 Бых Д. М..docx
+++ b/1-2_Discrete_math/2sem/homeworks/ДЗ 6 Бых Д. М..docx
@@ -757,10 +757,10 @@
             <wp:positionV relativeFrom="paragraph">
               <wp:posOffset>635</wp:posOffset>
             </wp:positionV>
-            <wp:extent cx="6309360" cy="5411470"/>
+            <wp:extent cx="4601845" cy="4832985"/>
             <wp:effectExtent l="0" t="0" r="0" b="0"/>
             <wp:wrapSquare wrapText="largest"/>
-            <wp:docPr id="1" name="Image1"/>
+            <wp:docPr id="1" name="Image2"/>
             <wp:cNvGraphicFramePr>
               <a:graphicFrameLocks xmlns:a="http://schemas.openxmlformats.org/drawingml/2006/main" noChangeAspect="1"/>
             </wp:cNvGraphicFramePr>
@@ -768,7 +768,7 @@
               <a:graphicData uri="http://schemas.openxmlformats.org/drawingml/2006/picture">
                 <pic:pic xmlns:pic="http://schemas.openxmlformats.org/drawingml/2006/picture">
                   <pic:nvPicPr>
-                    <pic:cNvPr id="1" name="Image1"/>
+                    <pic:cNvPr id="1" name="Image2"/>
                     <pic:cNvPicPr>
                       <a:picLocks noChangeAspect="1" noChangeArrowheads="1"/>
                     </pic:cNvPicPr>
@@ -782,7 +782,7 @@
                   <pic:spPr bwMode="auto">
                     <a:xfrm>
                       <a:off x="0" y="0"/>
-                      <a:ext cx="6309360" cy="5411470"/>
+                      <a:ext cx="4601845" cy="4832985"/>
                     </a:xfrm>
                     <a:prstGeom prst="rect">
                       <a:avLst/>
@@ -838,6 +838,7 @@
         </w:tabs>
         <w:ind w:start="1080" w:hanging="360"/>
       </w:pPr>
+      <w:rPr/>
     </w:lvl>
     <w:lvl w:ilvl="2">
       <w:start w:val="1"/>
@@ -850,6 +851,7 @@
         </w:tabs>
         <w:ind w:start="1440" w:hanging="360"/>
       </w:pPr>
+      <w:rPr/>
     </w:lvl>
     <w:lvl w:ilvl="3">
       <w:start w:val="1"/>
@@ -862,6 +864,7 @@
         </w:tabs>
         <w:ind w:start="1800" w:hanging="360"/>
       </w:pPr>
+      <w:rPr/>
     </w:lvl>
     <w:lvl w:ilvl="4">
       <w:start w:val="1"/>
@@ -874,6 +877,7 @@
         </w:tabs>
         <w:ind w:start="2160" w:hanging="360"/>
       </w:pPr>
+      <w:rPr/>
     </w:lvl>
     <w:lvl w:ilvl="5">
       <w:start w:val="1"/>
@@ -886,6 +890,7 @@
         </w:tabs>
         <w:ind w:start="2520" w:hanging="360"/>
       </w:pPr>
+      <w:rPr/>
     </w:lvl>
     <w:lvl w:ilvl="6">
       <w:start w:val="1"/>
@@ -898,6 +903,7 @@
         </w:tabs>
         <w:ind w:start="2880" w:hanging="360"/>
       </w:pPr>
+      <w:rPr/>
     </w:lvl>
     <w:lvl w:ilvl="7">
       <w:start w:val="1"/>
@@ -910,6 +916,7 @@
         </w:tabs>
         <w:ind w:start="3240" w:hanging="360"/>
       </w:pPr>
+      <w:rPr/>
     </w:lvl>
     <w:lvl w:ilvl="8">
       <w:start w:val="1"/>
@@ -922,6 +929,7 @@
         </w:tabs>
         <w:ind w:start="3600" w:hanging="360"/>
       </w:pPr>
+      <w:rPr/>
     </w:lvl>
   </w:abstractNum>
   <w:abstractNum w:abstractNumId="2">
@@ -951,6 +959,7 @@
         </w:tabs>
         <w:ind w:start="1080" w:hanging="360"/>
       </w:pPr>
+      <w:rPr/>
     </w:lvl>
     <w:lvl w:ilvl="2">
       <w:start w:val="1"/>
@@ -963,6 +972,7 @@
         </w:tabs>
         <w:ind w:start="1440" w:hanging="360"/>
       </w:pPr>
+      <w:rPr/>
     </w:lvl>
     <w:lvl w:ilvl="3">
       <w:start w:val="1"/>
@@ -975,6 +985,7 @@
         </w:tabs>
         <w:ind w:start="1800" w:hanging="360"/>
       </w:pPr>
+      <w:rPr/>
     </w:lvl>
     <w:lvl w:ilvl="4">
       <w:start w:val="1"/>
@@ -987,6 +998,7 @@
         </w:tabs>
         <w:ind w:start="2160" w:hanging="360"/>
       </w:pPr>
+      <w:rPr/>
     </w:lvl>
     <w:lvl w:ilvl="5">
       <w:start w:val="1"/>
@@ -999,6 +1011,7 @@
         </w:tabs>
         <w:ind w:start="2520" w:hanging="360"/>
       </w:pPr>
+      <w:rPr/>
     </w:lvl>
     <w:lvl w:ilvl="6">
       <w:start w:val="1"/>
@@ -1011,6 +1024,7 @@
         </w:tabs>
         <w:ind w:start="2880" w:hanging="360"/>
       </w:pPr>
+      <w:rPr/>
     </w:lvl>
     <w:lvl w:ilvl="7">
       <w:start w:val="1"/>
@@ -1023,6 +1037,7 @@
         </w:tabs>
         <w:ind w:start="3240" w:hanging="360"/>
       </w:pPr>
+      <w:rPr/>
     </w:lvl>
     <w:lvl w:ilvl="8">
       <w:start w:val="1"/>
@@ -1035,6 +1050,7 @@
         </w:tabs>
         <w:ind w:start="3600" w:hanging="360"/>
       </w:pPr>
+      <w:rPr/>
     </w:lvl>
   </w:abstractNum>
   <w:abstractNum w:abstractNumId="3">
@@ -1064,6 +1080,7 @@
         </w:tabs>
         <w:ind w:start="1080" w:hanging="360"/>
       </w:pPr>
+      <w:rPr/>
     </w:lvl>
     <w:lvl w:ilvl="2">
       <w:start w:val="1"/>
@@ -1076,6 +1093,7 @@
         </w:tabs>
         <w:ind w:start="1440" w:hanging="360"/>
       </w:pPr>
+      <w:rPr/>
     </w:lvl>
     <w:lvl w:ilvl="3">
       <w:start w:val="1"/>
@@ -1088,6 +1106,7 @@
         </w:tabs>
         <w:ind w:start="1800" w:hanging="360"/>
       </w:pPr>
+      <w:rPr/>
     </w:lvl>
     <w:lvl w:ilvl="4">
       <w:start w:val="1"/>
@@ -1100,6 +1119,7 @@
         </w:tabs>
         <w:ind w:start="2160" w:hanging="360"/>
       </w:pPr>
+      <w:rPr/>
     </w:lvl>
     <w:lvl w:ilvl="5">
       <w:start w:val="1"/>
@@ -1112,6 +1132,7 @@
         </w:tabs>
         <w:ind w:start="2520" w:hanging="360"/>
       </w:pPr>
+      <w:rPr/>
     </w:lvl>
     <w:lvl w:ilvl="6">
       <w:start w:val="1"/>
@@ -1124,6 +1145,7 @@
         </w:tabs>
         <w:ind w:start="2880" w:hanging="360"/>
       </w:pPr>
+      <w:rPr/>
     </w:lvl>
     <w:lvl w:ilvl="7">
       <w:start w:val="1"/>
@@ -1136,6 +1158,7 @@
         </w:tabs>
         <w:ind w:start="3240" w:hanging="360"/>
       </w:pPr>
+      <w:rPr/>
     </w:lvl>
     <w:lvl w:ilvl="8">
       <w:start w:val="1"/>
@@ -1148,6 +1171,7 @@
         </w:tabs>
         <w:ind w:start="3600" w:hanging="360"/>
       </w:pPr>
+      <w:rPr/>
     </w:lvl>
   </w:abstractNum>
   <w:abstractNum w:abstractNumId="4">
@@ -1175,6 +1199,7 @@
         </w:tabs>
         <w:ind w:start="1080" w:hanging="360"/>
       </w:pPr>
+      <w:rPr/>
     </w:lvl>
     <w:lvl w:ilvl="2">
       <w:start w:val="1"/>
@@ -1187,6 +1212,7 @@
         </w:tabs>
         <w:ind w:start="1440" w:hanging="360"/>
       </w:pPr>
+      <w:rPr/>
     </w:lvl>
     <w:lvl w:ilvl="3">
       <w:start w:val="1"/>
@@ -1199,6 +1225,7 @@
         </w:tabs>
         <w:ind w:start="1800" w:hanging="360"/>
       </w:pPr>
+      <w:rPr/>
     </w:lvl>
     <w:lvl w:ilvl="4">
       <w:start w:val="1"/>
@@ -1211,6 +1238,7 @@
         </w:tabs>
         <w:ind w:start="2160" w:hanging="360"/>
       </w:pPr>
+      <w:rPr/>
     </w:lvl>
     <w:lvl w:ilvl="5">
       <w:start w:val="1"/>
@@ -1223,6 +1251,7 @@
         </w:tabs>
         <w:ind w:start="2520" w:hanging="360"/>
       </w:pPr>
+      <w:rPr/>
     </w:lvl>
     <w:lvl w:ilvl="6">
       <w:start w:val="1"/>
@@ -1235,6 +1264,7 @@
         </w:tabs>
         <w:ind w:start="2880" w:hanging="360"/>
       </w:pPr>
+      <w:rPr/>
     </w:lvl>
     <w:lvl w:ilvl="7">
       <w:start w:val="1"/>
@@ -1247,6 +1277,7 @@
         </w:tabs>
         <w:ind w:start="3240" w:hanging="360"/>
       </w:pPr>
+      <w:rPr/>
     </w:lvl>
     <w:lvl w:ilvl="8">
       <w:start w:val="1"/>
@@ -1259,6 +1290,7 @@
         </w:tabs>
         <w:ind w:start="3600" w:hanging="360"/>
       </w:pPr>
+      <w:rPr/>
     </w:lvl>
   </w:abstractNum>
   <w:abstractNum w:abstractNumId="5">
@@ -1286,6 +1318,7 @@
         </w:tabs>
         <w:ind w:start="1080" w:hanging="360"/>
       </w:pPr>
+      <w:rPr/>
     </w:lvl>
     <w:lvl w:ilvl="2">
       <w:start w:val="1"/>
@@ -1298,6 +1331,7 @@
         </w:tabs>
         <w:ind w:start="1440" w:hanging="360"/>
       </w:pPr>
+      <w:rPr/>
     </w:lvl>
     <w:lvl w:ilvl="3">
       <w:start w:val="1"/>
@@ -1310,6 +1344,7 @@
         </w:tabs>
         <w:ind w:start="1800" w:hanging="360"/>
       </w:pPr>
+      <w:rPr/>
     </w:lvl>
     <w:lvl w:ilvl="4">
       <w:start w:val="1"/>
@@ -1322,6 +1357,7 @@
         </w:tabs>
         <w:ind w:start="2160" w:hanging="360"/>
       </w:pPr>
+      <w:rPr/>
     </w:lvl>
     <w:lvl w:ilvl="5">
       <w:start w:val="1"/>
@@ -1334,6 +1370,7 @@
         </w:tabs>
         <w:ind w:start="2520" w:hanging="360"/>
       </w:pPr>
+      <w:rPr/>
     </w:lvl>
     <w:lvl w:ilvl="6">
       <w:start w:val="1"/>
@@ -1346,6 +1383,7 @@
         </w:tabs>
         <w:ind w:start="2880" w:hanging="360"/>
       </w:pPr>
+      <w:rPr/>
     </w:lvl>
     <w:lvl w:ilvl="7">
       <w:start w:val="1"/>
@@ -1358,6 +1396,7 @@
         </w:tabs>
         <w:ind w:start="3240" w:hanging="360"/>
       </w:pPr>
+      <w:rPr/>
     </w:lvl>
     <w:lvl w:ilvl="8">
       <w:start w:val="1"/>
@@ -1370,6 +1409,7 @@
         </w:tabs>
         <w:ind w:start="3600" w:hanging="360"/>
       </w:pPr>
+      <w:rPr/>
     </w:lvl>
   </w:abstractNum>
   <w:abstractNum w:abstractNumId="6">
@@ -1397,6 +1437,7 @@
         </w:tabs>
         <w:ind w:start="1080" w:hanging="360"/>
       </w:pPr>
+      <w:rPr/>
     </w:lvl>
     <w:lvl w:ilvl="2">
       <w:start w:val="1"/>
@@ -1409,6 +1450,7 @@
         </w:tabs>
         <w:ind w:start="1440" w:hanging="360"/>
       </w:pPr>
+      <w:rPr/>
     </w:lvl>
     <w:lvl w:ilvl="3">
       <w:start w:val="1"/>
@@ -1421,6 +1463,7 @@
         </w:tabs>
         <w:ind w:start="1800" w:hanging="360"/>
       </w:pPr>
+      <w:rPr/>
     </w:lvl>
     <w:lvl w:ilvl="4">
       <w:start w:val="1"/>
@@ -1433,6 +1476,7 @@
         </w:tabs>
         <w:ind w:start="2160" w:hanging="360"/>
       </w:pPr>
+      <w:rPr/>
     </w:lvl>
     <w:lvl w:ilvl="5">
       <w:start w:val="1"/>
@@ -1445,6 +1489,7 @@
         </w:tabs>
         <w:ind w:start="2520" w:hanging="360"/>
       </w:pPr>
+      <w:rPr/>
     </w:lvl>
     <w:lvl w:ilvl="6">
       <w:start w:val="1"/>
@@ -1457,6 +1502,7 @@
         </w:tabs>
         <w:ind w:start="2880" w:hanging="360"/>
       </w:pPr>
+      <w:rPr/>
     </w:lvl>
     <w:lvl w:ilvl="7">
       <w:start w:val="1"/>
@@ -1469,6 +1515,7 @@
         </w:tabs>
         <w:ind w:start="3240" w:hanging="360"/>
       </w:pPr>
+      <w:rPr/>
     </w:lvl>
     <w:lvl w:ilvl="8">
       <w:start w:val="1"/>
@@ -1481,6 +1528,7 @@
         </w:tabs>
         <w:ind w:start="3600" w:hanging="360"/>
       </w:pPr>
+      <w:rPr/>
     </w:lvl>
   </w:abstractNum>
   <w:abstractNum w:abstractNumId="7">
@@ -1631,7 +1679,7 @@
   <w:docDefaults>
     <w:rPrDefault>
       <w:rPr>
-        <w:rFonts w:ascii="Cambria" w:hAnsi="Cambria" w:eastAsia="ＭＳ 明朝" w:cs="" w:asciiTheme="minorHAnsi" w:cstheme="minorBidi" w:eastAsiaTheme="minorEastAsia" w:hAnsiTheme="minorHAnsi"/>
+        <w:rFonts w:ascii="Cambria" w:hAnsi="Cambria" w:eastAsia="" w:cs="" w:asciiTheme="minorHAnsi" w:cstheme="minorBidi" w:eastAsiaTheme="minorEastAsia" w:hAnsiTheme="minorHAnsi"/>
         <w:sz w:val="22"/>
         <w:szCs w:val="22"/>
         <w:lang w:val="en-US" w:eastAsia="en-US" w:bidi="ar-SA"/>
@@ -2018,12 +2066,13 @@
     <w:rsid w:val="00fc693f"/>
     <w:pPr>
       <w:widowControl/>
+      <w:suppressAutoHyphens w:val="true"/>
       <w:bidi w:val="0"/>
       <w:spacing w:lineRule="auto" w:line="276" w:before="0" w:after="200"/>
       <w:jc w:val="start"/>
     </w:pPr>
     <w:rPr>
-      <w:rFonts w:ascii="Cambria" w:hAnsi="Cambria" w:eastAsia="ＭＳ 明朝" w:cs="" w:asciiTheme="minorHAnsi" w:cstheme="minorBidi" w:eastAsiaTheme="minorEastAsia" w:hAnsiTheme="minorHAnsi"/>
+      <w:rFonts w:ascii="Cambria" w:hAnsi="Cambria" w:eastAsia="" w:cs="" w:asciiTheme="minorHAnsi" w:cstheme="minorBidi" w:eastAsiaTheme="minorEastAsia" w:hAnsiTheme="minorHAnsi"/>
       <w:color w:val="auto"/>
       <w:kern w:val="0"/>
       <w:sz w:val="22"/>
@@ -2046,7 +2095,7 @@
       <w:outlineLvl w:val="0"/>
     </w:pPr>
     <w:rPr>
-      <w:rFonts w:ascii="Calibri" w:hAnsi="Calibri" w:eastAsia="ＭＳ ゴシック" w:cs="" w:asciiTheme="majorHAnsi" w:cstheme="majorBidi" w:eastAsiaTheme="majorEastAsia" w:hAnsiTheme="majorHAnsi"/>
+      <w:rFonts w:ascii="Calibri" w:hAnsi="Calibri" w:eastAsia="" w:cs="" w:asciiTheme="majorHAnsi" w:cstheme="majorBidi" w:eastAsiaTheme="majorEastAsia" w:hAnsiTheme="majorHAnsi"/>
       <w:b/>
       <w:bCs/>
       <w:color w:themeColor="accent1" w:themeShade="bf" w:val="365F91"/>
@@ -2070,7 +2119,7 @@
       <w:outlineLvl w:val="1"/>
     </w:pPr>
     <w:rPr>
-      <w:rFonts w:ascii="Calibri" w:hAnsi="Calibri" w:eastAsia="ＭＳ ゴシック" w:cs="" w:asciiTheme="majorHAnsi" w:cstheme="majorBidi" w:eastAsiaTheme="majorEastAsia" w:hAnsiTheme="majorHAnsi"/>
+      <w:rFonts w:ascii="Calibri" w:hAnsi="Calibri" w:eastAsia="" w:cs="" w:asciiTheme="majorHAnsi" w:cstheme="majorBidi" w:eastAsiaTheme="majorEastAsia" w:hAnsiTheme="majorHAnsi"/>
       <w:b/>
       <w:bCs/>
       <w:color w:themeColor="accent1" w:val="4F81BD"/>
@@ -2094,7 +2143,7 @@
       <w:outlineLvl w:val="2"/>
     </w:pPr>
     <w:rPr>
-      <w:rFonts w:ascii="Calibri" w:hAnsi="Calibri" w:eastAsia="ＭＳ ゴシック" w:cs="" w:asciiTheme="majorHAnsi" w:cstheme="majorBidi" w:eastAsiaTheme="majorEastAsia" w:hAnsiTheme="majorHAnsi"/>
+      <w:rFonts w:ascii="Calibri" w:hAnsi="Calibri" w:eastAsia="" w:cs="" w:asciiTheme="majorHAnsi" w:cstheme="majorBidi" w:eastAsiaTheme="majorEastAsia" w:hAnsiTheme="majorHAnsi"/>
       <w:b/>
       <w:bCs/>
       <w:color w:themeColor="accent1" w:val="4F81BD"/>
@@ -2117,7 +2166,7 @@
       <w:outlineLvl w:val="3"/>
     </w:pPr>
     <w:rPr>
-      <w:rFonts w:ascii="Calibri" w:hAnsi="Calibri" w:eastAsia="ＭＳ ゴシック" w:cs="" w:asciiTheme="majorHAnsi" w:cstheme="majorBidi" w:eastAsiaTheme="majorEastAsia" w:hAnsiTheme="majorHAnsi"/>
+      <w:rFonts w:ascii="Calibri" w:hAnsi="Calibri" w:eastAsia="" w:cs="" w:asciiTheme="majorHAnsi" w:cstheme="majorBidi" w:eastAsiaTheme="majorEastAsia" w:hAnsiTheme="majorHAnsi"/>
       <w:b/>
       <w:bCs/>
       <w:i/>
@@ -2142,7 +2191,7 @@
       <w:outlineLvl w:val="4"/>
     </w:pPr>
     <w:rPr>
-      <w:rFonts w:ascii="Calibri" w:hAnsi="Calibri" w:eastAsia="ＭＳ ゴシック" w:cs="" w:asciiTheme="majorHAnsi" w:cstheme="majorBidi" w:eastAsiaTheme="majorEastAsia" w:hAnsiTheme="majorHAnsi"/>
+      <w:rFonts w:ascii="Calibri" w:hAnsi="Calibri" w:eastAsia="" w:cs="" w:asciiTheme="majorHAnsi" w:cstheme="majorBidi" w:eastAsiaTheme="majorEastAsia" w:hAnsiTheme="majorHAnsi"/>
       <w:color w:themeColor="accent1" w:themeShade="7f" w:val="243F60"/>
     </w:rPr>
   </w:style>
@@ -2163,7 +2212,7 @@
       <w:outlineLvl w:val="5"/>
     </w:pPr>
     <w:rPr>
-      <w:rFonts w:ascii="Calibri" w:hAnsi="Calibri" w:eastAsia="ＭＳ ゴシック" w:cs="" w:asciiTheme="majorHAnsi" w:cstheme="majorBidi" w:eastAsiaTheme="majorEastAsia" w:hAnsiTheme="majorHAnsi"/>
+      <w:rFonts w:ascii="Calibri" w:hAnsi="Calibri" w:eastAsia="" w:cs="" w:asciiTheme="majorHAnsi" w:cstheme="majorBidi" w:eastAsiaTheme="majorEastAsia" w:hAnsiTheme="majorHAnsi"/>
       <w:i/>
       <w:iCs/>
       <w:color w:themeColor="accent1" w:themeShade="7f" w:val="243F60"/>
@@ -2186,7 +2235,7 @@
       <w:outlineLvl w:val="6"/>
     </w:pPr>
     <w:rPr>
-      <w:rFonts w:ascii="Calibri" w:hAnsi="Calibri" w:eastAsia="ＭＳ ゴシック" w:cs="" w:asciiTheme="majorHAnsi" w:cstheme="majorBidi" w:eastAsiaTheme="majorEastAsia" w:hAnsiTheme="majorHAnsi"/>
+      <w:rFonts w:ascii="Calibri" w:hAnsi="Calibri" w:eastAsia="" w:cs="" w:asciiTheme="majorHAnsi" w:cstheme="majorBidi" w:eastAsiaTheme="majorEastAsia" w:hAnsiTheme="majorHAnsi"/>
       <w:i/>
       <w:iCs/>
       <w:color w:themeColor="text1" w:themeTint="bf" w:val="404040"/>
@@ -2209,7 +2258,7 @@
       <w:outlineLvl w:val="7"/>
     </w:pPr>
     <w:rPr>
-      <w:rFonts w:ascii="Calibri" w:hAnsi="Calibri" w:eastAsia="ＭＳ ゴシック" w:cs="" w:asciiTheme="majorHAnsi" w:cstheme="majorBidi" w:eastAsiaTheme="majorEastAsia" w:hAnsiTheme="majorHAnsi"/>
+      <w:rFonts w:ascii="Calibri" w:hAnsi="Calibri" w:eastAsia="" w:cs="" w:asciiTheme="majorHAnsi" w:cstheme="majorBidi" w:eastAsiaTheme="majorEastAsia" w:hAnsiTheme="majorHAnsi"/>
       <w:color w:themeColor="accent1" w:val="4F81BD"/>
       <w:sz w:val="20"/>
       <w:szCs w:val="20"/>
@@ -2232,7 +2281,7 @@
       <w:outlineLvl w:val="8"/>
     </w:pPr>
     <w:rPr>
-      <w:rFonts w:ascii="Calibri" w:hAnsi="Calibri" w:eastAsia="ＭＳ ゴシック" w:cs="" w:asciiTheme="majorHAnsi" w:cstheme="majorBidi" w:eastAsiaTheme="majorEastAsia" w:hAnsiTheme="majorHAnsi"/>
+      <w:rFonts w:ascii="Calibri" w:hAnsi="Calibri" w:eastAsia="" w:cs="" w:asciiTheme="majorHAnsi" w:cstheme="majorBidi" w:eastAsiaTheme="majorEastAsia" w:hAnsiTheme="majorHAnsi"/>
       <w:i/>
       <w:iCs/>
       <w:color w:themeColor="text1" w:themeTint="bf" w:val="404040"/>
@@ -2274,7 +2323,7 @@
     <w:qFormat/>
     <w:rsid w:val="00fc693f"/>
     <w:rPr>
-      <w:rFonts w:ascii="Calibri" w:hAnsi="Calibri" w:eastAsia="ＭＳ ゴシック" w:cs="" w:asciiTheme="majorHAnsi" w:cstheme="majorBidi" w:eastAsiaTheme="majorEastAsia" w:hAnsiTheme="majorHAnsi"/>
+      <w:rFonts w:ascii="Calibri" w:hAnsi="Calibri" w:eastAsia="" w:cs="" w:asciiTheme="majorHAnsi" w:cstheme="majorBidi" w:eastAsiaTheme="majorEastAsia" w:hAnsiTheme="majorHAnsi"/>
       <w:b/>
       <w:bCs/>
       <w:color w:themeColor="accent1" w:themeShade="bf" w:val="365F91"/>
@@ -2290,7 +2339,7 @@
     <w:qFormat/>
     <w:rsid w:val="00fc693f"/>
     <w:rPr>
-      <w:rFonts w:ascii="Calibri" w:hAnsi="Calibri" w:eastAsia="ＭＳ ゴシック" w:cs="" w:asciiTheme="majorHAnsi" w:cstheme="majorBidi" w:eastAsiaTheme="majorEastAsia" w:hAnsiTheme="majorHAnsi"/>
+      <w:rFonts w:ascii="Calibri" w:hAnsi="Calibri" w:eastAsia="" w:cs="" w:asciiTheme="majorHAnsi" w:cstheme="majorBidi" w:eastAsiaTheme="majorEastAsia" w:hAnsiTheme="majorHAnsi"/>
       <w:b/>
       <w:bCs/>
       <w:color w:themeColor="accent1" w:val="4F81BD"/>
@@ -2306,7 +2355,7 @@
     <w:qFormat/>
     <w:rsid w:val="00fc693f"/>
     <w:rPr>
-      <w:rFonts w:ascii="Calibri" w:hAnsi="Calibri" w:eastAsia="ＭＳ ゴシック" w:cs="" w:asciiTheme="majorHAnsi" w:cstheme="majorBidi" w:eastAsiaTheme="majorEastAsia" w:hAnsiTheme="majorHAnsi"/>
+      <w:rFonts w:ascii="Calibri" w:hAnsi="Calibri" w:eastAsia="" w:cs="" w:asciiTheme="majorHAnsi" w:cstheme="majorBidi" w:eastAsiaTheme="majorEastAsia" w:hAnsiTheme="majorHAnsi"/>
       <w:b/>
       <w:bCs/>
       <w:color w:themeColor="accent1" w:val="4F81BD"/>
@@ -2320,7 +2369,7 @@
     <w:qFormat/>
     <w:rsid w:val="00fc693f"/>
     <w:rPr>
-      <w:rFonts w:ascii="Calibri" w:hAnsi="Calibri" w:eastAsia="ＭＳ ゴシック" w:cs="" w:asciiTheme="majorHAnsi" w:cstheme="majorBidi" w:eastAsiaTheme="majorEastAsia" w:hAnsiTheme="majorHAnsi"/>
+      <w:rFonts w:ascii="Calibri" w:hAnsi="Calibri" w:eastAsia="" w:cs="" w:asciiTheme="majorHAnsi" w:cstheme="majorBidi" w:eastAsiaTheme="majorEastAsia" w:hAnsiTheme="majorHAnsi"/>
       <w:color w:themeColor="text2" w:themeShade="bf" w:val="17365D"/>
       <w:spacing w:val="5"/>
       <w:kern w:val="2"/>
@@ -2336,7 +2385,7 @@
     <w:qFormat/>
     <w:rsid w:val="00fc693f"/>
     <w:rPr>
-      <w:rFonts w:ascii="Calibri" w:hAnsi="Calibri" w:eastAsia="ＭＳ ゴシック" w:cs="" w:asciiTheme="majorHAnsi" w:cstheme="majorBidi" w:eastAsiaTheme="majorEastAsia" w:hAnsiTheme="majorHAnsi"/>
+      <w:rFonts w:ascii="Calibri" w:hAnsi="Calibri" w:eastAsia="" w:cs="" w:asciiTheme="majorHAnsi" w:cstheme="majorBidi" w:eastAsiaTheme="majorEastAsia" w:hAnsiTheme="majorHAnsi"/>
       <w:i/>
       <w:iCs/>
       <w:color w:themeColor="accent1" w:val="4F81BD"/>
@@ -2409,7 +2458,7 @@
     <w:qFormat/>
     <w:rsid w:val="00fc693f"/>
     <w:rPr>
-      <w:rFonts w:ascii="Calibri" w:hAnsi="Calibri" w:eastAsia="ＭＳ ゴシック" w:cs="" w:asciiTheme="majorHAnsi" w:cstheme="majorBidi" w:eastAsiaTheme="majorEastAsia" w:hAnsiTheme="majorHAnsi"/>
+      <w:rFonts w:ascii="Calibri" w:hAnsi="Calibri" w:eastAsia="" w:cs="" w:asciiTheme="majorHAnsi" w:cstheme="majorBidi" w:eastAsiaTheme="majorEastAsia" w:hAnsiTheme="majorHAnsi"/>
       <w:b/>
       <w:bCs/>
       <w:i/>
@@ -2426,7 +2475,7 @@
     <w:qFormat/>
     <w:rsid w:val="00fc693f"/>
     <w:rPr>
-      <w:rFonts w:ascii="Calibri" w:hAnsi="Calibri" w:eastAsia="ＭＳ ゴシック" w:cs="" w:asciiTheme="majorHAnsi" w:cstheme="majorBidi" w:eastAsiaTheme="majorEastAsia" w:hAnsiTheme="majorHAnsi"/>
+      <w:rFonts w:ascii="Calibri" w:hAnsi="Calibri" w:eastAsia="" w:cs="" w:asciiTheme="majorHAnsi" w:cstheme="majorBidi" w:eastAsiaTheme="majorEastAsia" w:hAnsiTheme="majorHAnsi"/>
       <w:color w:themeColor="accent1" w:themeShade="7f" w:val="243F60"/>
     </w:rPr>
   </w:style>
@@ -2439,7 +2488,7 @@
     <w:qFormat/>
     <w:rsid w:val="00fc693f"/>
     <w:rPr>
-      <w:rFonts w:ascii="Calibri" w:hAnsi="Calibri" w:eastAsia="ＭＳ ゴシック" w:cs="" w:asciiTheme="majorHAnsi" w:cstheme="majorBidi" w:eastAsiaTheme="majorEastAsia" w:hAnsiTheme="majorHAnsi"/>
+      <w:rFonts w:ascii="Calibri" w:hAnsi="Calibri" w:eastAsia="" w:cs="" w:asciiTheme="majorHAnsi" w:cstheme="majorBidi" w:eastAsiaTheme="majorEastAsia" w:hAnsiTheme="majorHAnsi"/>
       <w:i/>
       <w:iCs/>
       <w:color w:themeColor="accent1" w:themeShade="7f" w:val="243F60"/>
@@ -2454,7 +2503,7 @@
     <w:qFormat/>
     <w:rsid w:val="00fc693f"/>
     <w:rPr>
-      <w:rFonts w:ascii="Calibri" w:hAnsi="Calibri" w:eastAsia="ＭＳ ゴシック" w:cs="" w:asciiTheme="majorHAnsi" w:cstheme="majorBidi" w:eastAsiaTheme="majorEastAsia" w:hAnsiTheme="majorHAnsi"/>
+      <w:rFonts w:ascii="Calibri" w:hAnsi="Calibri" w:eastAsia="" w:cs="" w:asciiTheme="majorHAnsi" w:cstheme="majorBidi" w:eastAsiaTheme="majorEastAsia" w:hAnsiTheme="majorHAnsi"/>
       <w:i/>
       <w:iCs/>
       <w:color w:themeColor="text1" w:themeTint="bf" w:val="404040"/>
@@ -2469,7 +2518,7 @@
     <w:qFormat/>
     <w:rsid w:val="00fc693f"/>
     <w:rPr>
-      <w:rFonts w:ascii="Calibri" w:hAnsi="Calibri" w:eastAsia="ＭＳ ゴシック" w:cs="" w:asciiTheme="majorHAnsi" w:cstheme="majorBidi" w:eastAsiaTheme="majorEastAsia" w:hAnsiTheme="majorHAnsi"/>
+      <w:rFonts w:ascii="Calibri" w:hAnsi="Calibri" w:eastAsia="" w:cs="" w:asciiTheme="majorHAnsi" w:cstheme="majorBidi" w:eastAsiaTheme="majorEastAsia" w:hAnsiTheme="majorHAnsi"/>
       <w:color w:themeColor="accent1" w:val="4F81BD"/>
       <w:sz w:val="20"/>
       <w:szCs w:val="20"/>
@@ -2484,7 +2533,7 @@
     <w:qFormat/>
     <w:rsid w:val="00fc693f"/>
     <w:rPr>
-      <w:rFonts w:ascii="Calibri" w:hAnsi="Calibri" w:eastAsia="ＭＳ ゴシック" w:cs="" w:asciiTheme="majorHAnsi" w:cstheme="majorBidi" w:eastAsiaTheme="majorEastAsia" w:hAnsiTheme="majorHAnsi"/>
+      <w:rFonts w:ascii="Calibri" w:hAnsi="Calibri" w:eastAsia="" w:cs="" w:asciiTheme="majorHAnsi" w:cstheme="majorBidi" w:eastAsiaTheme="majorEastAsia" w:hAnsiTheme="majorHAnsi"/>
       <w:i/>
       <w:iCs/>
       <w:color w:themeColor="text1" w:themeTint="bf" w:val="404040"/>
@@ -2714,12 +2763,13 @@
     <w:rsid w:val="00fc693f"/>
     <w:pPr>
       <w:widowControl/>
+      <w:suppressAutoHyphens w:val="true"/>
       <w:bidi w:val="0"/>
       <w:spacing w:lineRule="auto" w:line="240" w:before="0" w:after="0"/>
       <w:jc w:val="start"/>
     </w:pPr>
     <w:rPr>
-      <w:rFonts w:ascii="Cambria" w:hAnsi="Cambria" w:eastAsia="ＭＳ 明朝" w:cs="" w:asciiTheme="minorHAnsi" w:cstheme="minorBidi" w:eastAsiaTheme="minorEastAsia" w:hAnsiTheme="minorHAnsi"/>
+      <w:rFonts w:ascii="Cambria" w:hAnsi="Cambria" w:eastAsia="" w:cs="" w:asciiTheme="minorHAnsi" w:cstheme="minorBidi" w:eastAsiaTheme="minorEastAsia" w:hAnsiTheme="minorHAnsi"/>
       <w:color w:val="auto"/>
       <w:kern w:val="0"/>
       <w:sz w:val="22"/>
@@ -2743,7 +2793,7 @@
       <w:contextualSpacing/>
     </w:pPr>
     <w:rPr>
-      <w:rFonts w:ascii="Calibri" w:hAnsi="Calibri" w:eastAsia="ＭＳ ゴシック" w:cs="" w:asciiTheme="majorHAnsi" w:cstheme="majorBidi" w:eastAsiaTheme="majorEastAsia" w:hAnsiTheme="majorHAnsi"/>
+      <w:rFonts w:ascii="Calibri" w:hAnsi="Calibri" w:eastAsia="" w:cs="" w:asciiTheme="majorHAnsi" w:cstheme="majorBidi" w:eastAsiaTheme="majorEastAsia" w:hAnsiTheme="majorHAnsi"/>
       <w:color w:themeColor="text2" w:themeShade="bf" w:val="17365D"/>
       <w:spacing w:val="5"/>
       <w:kern w:val="2"/>
@@ -2761,7 +2811,7 @@
     <w:rsid w:val="00fc693f"/>
     <w:pPr/>
     <w:rPr>
-      <w:rFonts w:ascii="Calibri" w:hAnsi="Calibri" w:eastAsia="ＭＳ ゴシック" w:cs="" w:asciiTheme="majorHAnsi" w:cstheme="majorBidi" w:eastAsiaTheme="majorEastAsia" w:hAnsiTheme="majorHAnsi"/>
+      <w:rFonts w:ascii="Calibri" w:hAnsi="Calibri" w:eastAsia="" w:cs="" w:asciiTheme="majorHAnsi" w:cstheme="majorBidi" w:eastAsiaTheme="majorEastAsia" w:hAnsiTheme="majorHAnsi"/>
       <w:i/>
       <w:iCs/>
       <w:color w:themeColor="accent1" w:val="4F81BD"/>
@@ -2994,12 +3044,13 @@
         <w:tab w:val="left" w:pos="3456" w:leader="none"/>
         <w:tab w:val="left" w:pos="4032" w:leader="none"/>
       </w:tabs>
+      <w:suppressAutoHyphens w:val="true"/>
       <w:bidi w:val="0"/>
       <w:spacing w:lineRule="auto" w:line="276" w:before="0" w:after="200"/>
       <w:jc w:val="start"/>
     </w:pPr>
     <w:rPr>
-      <w:rFonts w:ascii="Courier" w:hAnsi="Courier" w:eastAsia="ＭＳ 明朝" w:cs="" w:cstheme="minorBidi" w:eastAsiaTheme="minorEastAsia"/>
+      <w:rFonts w:ascii="Courier" w:hAnsi="Courier" w:eastAsia="" w:cs="" w:cstheme="minorBidi" w:eastAsiaTheme="minorEastAsia"/>
       <w:color w:val="auto"/>
       <w:kern w:val="0"/>
       <w:sz w:val="20"/>
@@ -6032,7 +6083,6 @@
       <w:pPr>
         <w:spacing w:before="0" w:after="0" w:line="240" w:lineRule="auto"/>
       </w:pPr>
-      <w:rPr/>
       <w:tblPr/>
       <w:tcPr>
         <w:tcBorders>
@@ -6172,7 +6222,6 @@
       <w:pPr>
         <w:spacing w:before="0" w:after="0" w:line="240" w:lineRule="auto"/>
       </w:pPr>
-      <w:rPr/>
       <w:tblPr/>
       <w:tcPr>
         <w:tcBorders>
@@ -6312,7 +6361,6 @@
       <w:pPr>
         <w:spacing w:before="0" w:after="0" w:line="240" w:lineRule="auto"/>
       </w:pPr>
-      <w:rPr/>
       <w:tblPr/>
       <w:tcPr>
         <w:tcBorders>
@@ -6452,7 +6500,6 @@
       <w:pPr>
         <w:spacing w:before="0" w:after="0" w:line="240" w:lineRule="auto"/>
       </w:pPr>
-      <w:rPr/>
       <w:tblPr/>
       <w:tcPr>
         <w:tcBorders>
@@ -6592,7 +6639,6 @@
       <w:pPr>
         <w:spacing w:before="0" w:after="0" w:line="240" w:lineRule="auto"/>
       </w:pPr>
-      <w:rPr/>
       <w:tblPr/>
       <w:tcPr>
         <w:tcBorders>
@@ -6732,7 +6778,6 @@
       <w:pPr>
         <w:spacing w:before="0" w:after="0" w:line="240" w:lineRule="auto"/>
       </w:pPr>
-      <w:rPr/>
       <w:tblPr/>
       <w:tcPr>
         <w:tcBorders>
@@ -6872,7 +6917,6 @@
       <w:pPr>
         <w:spacing w:before="0" w:after="0" w:line="240" w:lineRule="auto"/>
       </w:pPr>
-      <w:rPr/>
       <w:tblPr/>
       <w:tcPr>
         <w:tcBorders>

</xml_diff>